<commit_message>
Updated board member approval form
</commit_message>
<xml_diff>
--- a/public/downloads/FRIS_and_DFT_Board_member_approval_form.docx
+++ b/public/downloads/FRIS_and_DFT_Board_member_approval_form.docx
@@ -20,88 +20,107 @@
         <w:t>FRIS &amp; DFT Board Member Approval Form</w:t>
       </w:r>
     </w:p>
-    <w:p>
-      <w:r>
-        <w:t>Board member full name:</w:t>
-      </w:r>
-      <w:r>
-        <w:t xml:space="preserve"> </w:t>
-      </w:r>
-      <w:r>
-        <w:softHyphen/>
-      </w:r>
-      <w:r>
-        <w:softHyphen/>
-      </w:r>
-      <w:r>
-        <w:softHyphen/>
-      </w:r>
-      <w:r>
-        <w:softHyphen/>
-      </w:r>
-      <w:r>
-        <w:softHyphen/>
-      </w:r>
-      <w:r>
-        <w:softHyphen/>
-      </w:r>
-      <w:r>
-        <w:softHyphen/>
-      </w:r>
-      <w:r>
-        <w:softHyphen/>
-      </w:r>
-      <w:r>
-        <w:softHyphen/>
-      </w:r>
-      <w:r>
-        <w:softHyphen/>
-      </w:r>
-      <w:r>
-        <w:softHyphen/>
-      </w:r>
-      <w:r>
-        <w:softHyphen/>
-      </w:r>
-      <w:r>
-        <w:softHyphen/>
-      </w:r>
-      <w:r>
-        <w:softHyphen/>
-      </w:r>
-      <w:r>
-        <w:softHyphen/>
-      </w:r>
-      <w:r>
-        <w:softHyphen/>
-      </w:r>
-      <w:r>
-        <w:softHyphen/>
-      </w:r>
-      <w:r>
-        <w:softHyphen/>
-      </w:r>
-      <w:r>
-        <w:softHyphen/>
-        <w:t>____________________________________________________</w:t>
-      </w:r>
-    </w:p>
-    <w:p>
-      <w:r>
-        <w:t>Board member role (</w:t>
-      </w:r>
-      <w:proofErr w:type="spellStart"/>
-      <w:r>
-        <w:t>e.g</w:t>
-      </w:r>
-      <w:proofErr w:type="spellEnd"/>
-      <w:r>
-        <w:t xml:space="preserve"> Chairperson, treasurer):</w:t>
-      </w:r>
-      <w:r>
-        <w:t>__________________________________</w:t>
-      </w:r>
-    </w:p>
+    <w:p/>
+    <w:tbl>
+      <w:tblPr>
+        <w:tblStyle w:val="TableGrid"/>
+        <w:tblW w:w="0" w:type="auto"/>
+        <w:tblLook w:val="04A0" w:firstRow="1" w:lastRow="0" w:firstColumn="1" w:lastColumn="0" w:noHBand="0" w:noVBand="1"/>
+      </w:tblPr>
+      <w:tblGrid>
+        <w:gridCol w:w="3194"/>
+        <w:gridCol w:w="2911"/>
+        <w:gridCol w:w="2911"/>
+      </w:tblGrid>
+      <w:tr>
+        <w:tc>
+          <w:tcPr>
+            <w:tcW w:w="3194" w:type="dxa"/>
+          </w:tcPr>
+          <w:p/>
+        </w:tc>
+        <w:tc>
+          <w:tcPr>
+            <w:tcW w:w="2911" w:type="dxa"/>
+          </w:tcPr>
+          <w:p>
+            <w:r>
+              <w:t>Board member 1</w:t>
+            </w:r>
+          </w:p>
+        </w:tc>
+        <w:tc>
+          <w:tcPr>
+            <w:tcW w:w="2911" w:type="dxa"/>
+          </w:tcPr>
+          <w:p>
+            <w:r>
+              <w:t>Board member 2</w:t>
+            </w:r>
+          </w:p>
+        </w:tc>
+      </w:tr>
+      <w:tr>
+        <w:tc>
+          <w:tcPr>
+            <w:tcW w:w="3194" w:type="dxa"/>
+          </w:tcPr>
+          <w:p>
+            <w:r>
+              <w:t>Board member full name:</w:t>
+            </w:r>
+          </w:p>
+        </w:tc>
+        <w:tc>
+          <w:tcPr>
+            <w:tcW w:w="2911" w:type="dxa"/>
+          </w:tcPr>
+          <w:p/>
+        </w:tc>
+        <w:tc>
+          <w:tcPr>
+            <w:tcW w:w="2911" w:type="dxa"/>
+          </w:tcPr>
+          <w:p/>
+        </w:tc>
+      </w:tr>
+      <w:tr>
+        <w:tc>
+          <w:tcPr>
+            <w:tcW w:w="3194" w:type="dxa"/>
+          </w:tcPr>
+          <w:p>
+            <w:r>
+              <w:t>Board member role (</w:t>
+            </w:r>
+            <w:proofErr w:type="spellStart"/>
+            <w:r>
+              <w:t>e.g</w:t>
+            </w:r>
+            <w:proofErr w:type="spellEnd"/>
+            <w:r>
+              <w:t xml:space="preserve"> Chairperson, treasurer</w:t>
+            </w:r>
+            <w:r>
+              <w:t>) :</w:t>
+            </w:r>
+          </w:p>
+        </w:tc>
+        <w:tc>
+          <w:tcPr>
+            <w:tcW w:w="2911" w:type="dxa"/>
+          </w:tcPr>
+          <w:p/>
+        </w:tc>
+        <w:tc>
+          <w:tcPr>
+            <w:tcW w:w="2911" w:type="dxa"/>
+          </w:tcPr>
+          <w:p/>
+        </w:tc>
+      </w:tr>
+    </w:tbl>
+    <w:p/>
     <w:p>
       <w:r>
         <w:t>Name of Activity:</w:t>
@@ -158,19 +177,7 @@
         <w:spacing w:line="360" w:lineRule="auto"/>
       </w:pPr>
       <w:r>
-        <w:t xml:space="preserve">I, </w:t>
-      </w:r>
-      <w:r>
-        <w:t>__________________________________________________</w:t>
-      </w:r>
-      <w:r>
-        <w:t>the undersigned Board Member of the organisation</w:t>
-      </w:r>
-      <w:r>
-        <w:t>______________________________________________________</w:t>
-      </w:r>
-      <w:r>
-        <w:t>, hereby confirm that:</w:t>
+        <w:t>By signing this, I agree that:</w:t>
       </w:r>
     </w:p>
     <w:p>
@@ -235,7 +242,16 @@
       </w:r>
       <w:r>
         <w:tab/>
-        <w:t>____________________________________</w:t>
+        <w:t>___________________________</w:t>
+      </w:r>
+      <w:r>
+        <w:tab/>
+      </w:r>
+      <w:r>
+        <w:t>Date signed:</w:t>
+      </w:r>
+      <w:r>
+        <w:t>________________________</w:t>
       </w:r>
     </w:p>
     <w:p>
@@ -262,28 +278,89 @@
           <w:sz w:val="20"/>
           <w:szCs w:val="20"/>
         </w:rPr>
+        <w:t xml:space="preserve"> 1</w:t>
+      </w:r>
+      <w:r>
+        <w:rPr>
+          <w:sz w:val="20"/>
+          <w:szCs w:val="20"/>
+        </w:rPr>
         <w:t>)</w:t>
       </w:r>
       <w:r>
         <w:tab/>
       </w:r>
     </w:p>
+    <w:p>
+      <w:pPr>
+        <w:spacing w:after="0"/>
+        <w:ind w:left="2160" w:firstLine="720"/>
+      </w:pPr>
+    </w:p>
+    <w:p>
+      <w:pPr>
+        <w:spacing w:after="0"/>
+        <w:ind w:left="2160" w:firstLine="720"/>
+      </w:pPr>
+    </w:p>
+    <w:p>
+      <w:pPr>
+        <w:spacing w:after="0"/>
+      </w:pPr>
+      <w:r>
+        <w:t>Signature:</w:t>
+      </w:r>
+      <w:r>
+        <w:tab/>
+        <w:t>___________________________</w:t>
+      </w:r>
+      <w:r>
+        <w:tab/>
+      </w:r>
+      <w:r>
+        <w:t>Date signed:</w:t>
+      </w:r>
+      <w:r>
+        <w:t>________________________</w:t>
+      </w:r>
+    </w:p>
+    <w:p>
+      <w:pPr>
+        <w:spacing w:after="0"/>
+        <w:ind w:left="2160" w:firstLine="720"/>
+      </w:pPr>
+      <w:r>
+        <w:rPr>
+          <w:sz w:val="20"/>
+          <w:szCs w:val="20"/>
+        </w:rPr>
+        <w:t>(Board member</w:t>
+      </w:r>
+      <w:r>
+        <w:rPr>
+          <w:sz w:val="20"/>
+          <w:szCs w:val="20"/>
+        </w:rPr>
+        <w:t xml:space="preserve"> 2</w:t>
+      </w:r>
+      <w:r>
+        <w:rPr>
+          <w:sz w:val="20"/>
+          <w:szCs w:val="20"/>
+        </w:rPr>
+        <w:t>)</w:t>
+      </w:r>
+      <w:r>
+        <w:tab/>
+      </w:r>
+    </w:p>
+    <w:p>
+      <w:pPr>
+        <w:spacing w:after="0"/>
+      </w:pPr>
+    </w:p>
     <w:p/>
-    <w:p>
-      <w:r>
-        <w:t>Date signed</w:t>
-      </w:r>
-      <w:r>
-        <w:t>:</w:t>
-      </w:r>
-      <w:r>
-        <w:tab/>
-        <w:t>__________________</w:t>
-      </w:r>
-      <w:r>
-        <w:t>__________________</w:t>
-      </w:r>
-    </w:p>
+    <w:p/>
     <w:sectPr>
       <w:headerReference w:type="default" r:id="rId7"/>
       <w:pgSz w:w="11906" w:h="16838"/>
@@ -965,6 +1042,7 @@
   <w:style w:type="character" w:default="1" w:styleId="DefaultParagraphFont">
     <w:name w:val="Default Paragraph Font"/>
     <w:uiPriority w:val="1"/>
+    <w:semiHidden/>
     <w:unhideWhenUsed/>
   </w:style>
   <w:style w:type="table" w:default="1" w:styleId="TableNormal">
@@ -1031,6 +1109,25 @@
     <w:link w:val="Footer"/>
     <w:uiPriority w:val="99"/>
     <w:rsid w:val="00961575"/>
+  </w:style>
+  <w:style w:type="table" w:styleId="TableGrid">
+    <w:name w:val="Table Grid"/>
+    <w:basedOn w:val="TableNormal"/>
+    <w:uiPriority w:val="39"/>
+    <w:rsid w:val="007E37C3"/>
+    <w:pPr>
+      <w:spacing w:after="0" w:line="240" w:lineRule="auto"/>
+    </w:pPr>
+    <w:tblPr>
+      <w:tblBorders>
+        <w:top w:val="single" w:sz="4" w:space="0" w:color="auto"/>
+        <w:left w:val="single" w:sz="4" w:space="0" w:color="auto"/>
+        <w:bottom w:val="single" w:sz="4" w:space="0" w:color="auto"/>
+        <w:right w:val="single" w:sz="4" w:space="0" w:color="auto"/>
+        <w:insideH w:val="single" w:sz="4" w:space="0" w:color="auto"/>
+        <w:insideV w:val="single" w:sz="4" w:space="0" w:color="auto"/>
+      </w:tblBorders>
+    </w:tblPr>
   </w:style>
 </w:styles>
 </file>

</xml_diff>